<commit_message>
feat: Thêm chức năng quản lý giải ngân, hợp đồng tín dụng, đề nghị cấp bảo lãnh và xuất nhập kho xe.
</commit_message>
<xml_diff>
--- a/src/main/resources/templates/DeNghiCapBaoLanh/danh-sach-xe-de-nghi-cap-bao-lanh.docx
+++ b/src/main/resources/templates/DeNghiCapBaoLanh/danh-sach-xe-de-nghi-cap-bao-lanh.docx
@@ -263,7 +263,7 @@
         <w:rPr>
           <w:rFonts w:ascii="Times New Roman" w:hAnsi="Times New Roman" w:cs="Times New Roman"/>
           <w:color w:val="0E2841" w:themeColor="text2"/>
-          <w:szCs w:val="22"/>
+          <w:sz w:val="24"/>
         </w:rPr>
         <w:t>{{CURRENT_DATE}}</w:t>
       </w:r>
@@ -313,7 +313,7 @@
         <w:rPr>
           <w:rFonts w:ascii="Times New Roman" w:hAnsi="Times New Roman" w:cs="Times New Roman"/>
           <w:color w:val="0E2841" w:themeColor="text2"/>
-          <w:szCs w:val="22"/>
+          <w:sz w:val="24"/>
         </w:rPr>
         <w:t>{{CURRENT_DATE}}</w:t>
       </w:r>
@@ -374,18 +374,18 @@
         <w:tblLook w:val="04A0" w:firstRow="1" w:lastRow="0" w:firstColumn="1" w:lastColumn="0" w:noHBand="0" w:noVBand="1"/>
       </w:tblPr>
       <w:tblGrid>
-        <w:gridCol w:w="762"/>
-        <w:gridCol w:w="1754"/>
-        <w:gridCol w:w="1114"/>
-        <w:gridCol w:w="1250"/>
-        <w:gridCol w:w="1365"/>
+        <w:gridCol w:w="764"/>
+        <w:gridCol w:w="1791"/>
+        <w:gridCol w:w="1172"/>
+        <w:gridCol w:w="1269"/>
+        <w:gridCol w:w="1452"/>
         <w:gridCol w:w="795"/>
-        <w:gridCol w:w="823"/>
-        <w:gridCol w:w="717"/>
-        <w:gridCol w:w="708"/>
-        <w:gridCol w:w="1926"/>
-        <w:gridCol w:w="1162"/>
-        <w:gridCol w:w="1633"/>
+        <w:gridCol w:w="924"/>
+        <w:gridCol w:w="754"/>
+        <w:gridCol w:w="617"/>
+        <w:gridCol w:w="1785"/>
+        <w:gridCol w:w="1182"/>
+        <w:gridCol w:w="1504"/>
       </w:tblGrid>
       <w:tr>
         <w:trPr>
@@ -423,7 +423,7 @@
         </w:tc>
         <w:tc>
           <w:tcPr>
-            <w:tcW w:w="1835" w:type="dxa"/>
+            <w:tcW w:w="1791" w:type="dxa"/>
             <w:tcBorders>
               <w:top w:val="single" w:sz="4" w:space="0" w:color="auto"/>
               <w:left w:val="single" w:sz="4" w:space="0" w:color="auto"/>
@@ -453,7 +453,7 @@
         </w:tc>
         <w:tc>
           <w:tcPr>
-            <w:tcW w:w="1240" w:type="dxa"/>
+            <w:tcW w:w="1172" w:type="dxa"/>
             <w:tcBorders>
               <w:top w:val="single" w:sz="4" w:space="0" w:color="auto"/>
               <w:left w:val="single" w:sz="4" w:space="0" w:color="auto"/>
@@ -484,7 +484,7 @@
         </w:tc>
         <w:tc>
           <w:tcPr>
-            <w:tcW w:w="1291" w:type="dxa"/>
+            <w:tcW w:w="1269" w:type="dxa"/>
             <w:tcBorders>
               <w:top w:val="single" w:sz="4" w:space="0" w:color="auto"/>
               <w:left w:val="single" w:sz="4" w:space="0" w:color="auto"/>
@@ -522,7 +522,7 @@
         </w:tc>
         <w:tc>
           <w:tcPr>
-            <w:tcW w:w="1556" w:type="dxa"/>
+            <w:tcW w:w="1452" w:type="dxa"/>
             <w:tcBorders>
               <w:top w:val="single" w:sz="4" w:space="0" w:color="auto"/>
               <w:left w:val="single" w:sz="4" w:space="0" w:color="auto"/>
@@ -586,7 +586,7 @@
         </w:tc>
         <w:tc>
           <w:tcPr>
-            <w:tcW w:w="1045" w:type="dxa"/>
+            <w:tcW w:w="924" w:type="dxa"/>
             <w:tcBorders>
               <w:top w:val="single" w:sz="4" w:space="0" w:color="auto"/>
               <w:left w:val="single" w:sz="4" w:space="0" w:color="auto"/>
@@ -618,7 +618,7 @@
         </w:tc>
         <w:tc>
           <w:tcPr>
-            <w:tcW w:w="798" w:type="dxa"/>
+            <w:tcW w:w="754" w:type="dxa"/>
             <w:tcBorders>
               <w:top w:val="single" w:sz="4" w:space="0" w:color="auto"/>
               <w:left w:val="single" w:sz="4" w:space="0" w:color="auto"/>
@@ -650,7 +650,7 @@
         </w:tc>
         <w:tc>
           <w:tcPr>
-            <w:tcW w:w="874" w:type="dxa"/>
+            <w:tcW w:w="617" w:type="dxa"/>
             <w:tcBorders>
               <w:top w:val="single" w:sz="4" w:space="0" w:color="auto"/>
               <w:left w:val="single" w:sz="4" w:space="0" w:color="auto"/>
@@ -682,7 +682,7 @@
         </w:tc>
         <w:tc>
           <w:tcPr>
-            <w:tcW w:w="1142" w:type="dxa"/>
+            <w:tcW w:w="1785" w:type="dxa"/>
             <w:tcBorders>
               <w:top w:val="single" w:sz="4" w:space="0" w:color="auto"/>
               <w:left w:val="single" w:sz="4" w:space="0" w:color="auto"/>
@@ -716,7 +716,7 @@
         </w:tc>
         <w:tc>
           <w:tcPr>
-            <w:tcW w:w="1206" w:type="dxa"/>
+            <w:tcW w:w="1182" w:type="dxa"/>
             <w:tcBorders>
               <w:top w:val="single" w:sz="4" w:space="0" w:color="auto"/>
               <w:left w:val="single" w:sz="4" w:space="0" w:color="auto"/>
@@ -743,13 +743,22 @@
                 <w:bCs/>
                 <w:sz w:val="24"/>
               </w:rPr>
-              <w:t>Tỷ lệ bảo hành</w:t>
-            </w:r>
-          </w:p>
-        </w:tc>
-        <w:tc>
-          <w:tcPr>
-            <w:tcW w:w="1463" w:type="dxa"/>
+              <w:t xml:space="preserve">Tỷ lệ bảo </w:t>
+            </w:r>
+            <w:r>
+              <w:rPr>
+                <w:rFonts w:ascii="Times New Roman" w:hAnsi="Times New Roman" w:cs="Times New Roman"/>
+                <w:b/>
+                <w:bCs/>
+                <w:sz w:val="24"/>
+              </w:rPr>
+              <w:t>lãnh</w:t>
+            </w:r>
+          </w:p>
+        </w:tc>
+        <w:tc>
+          <w:tcPr>
+            <w:tcW w:w="1504" w:type="dxa"/>
             <w:tcBorders>
               <w:top w:val="single" w:sz="4" w:space="0" w:color="auto"/>
               <w:left w:val="single" w:sz="4" w:space="0" w:color="auto"/>
@@ -812,7 +821,7 @@
         </w:tc>
         <w:tc>
           <w:tcPr>
-            <w:tcW w:w="1835" w:type="dxa"/>
+            <w:tcW w:w="1791" w:type="dxa"/>
             <w:tcBorders>
               <w:top w:val="single" w:sz="4" w:space="0" w:color="auto"/>
               <w:left w:val="single" w:sz="4" w:space="0" w:color="auto"/>
@@ -854,7 +863,7 @@
         </w:tc>
         <w:tc>
           <w:tcPr>
-            <w:tcW w:w="1240" w:type="dxa"/>
+            <w:tcW w:w="1172" w:type="dxa"/>
             <w:tcBorders>
               <w:top w:val="single" w:sz="4" w:space="0" w:color="auto"/>
               <w:left w:val="single" w:sz="4" w:space="0" w:color="auto"/>
@@ -897,7 +906,7 @@
         </w:tc>
         <w:tc>
           <w:tcPr>
-            <w:tcW w:w="1291" w:type="dxa"/>
+            <w:tcW w:w="1269" w:type="dxa"/>
             <w:tcBorders>
               <w:top w:val="single" w:sz="4" w:space="0" w:color="auto"/>
               <w:left w:val="single" w:sz="4" w:space="0" w:color="auto"/>
@@ -940,7 +949,7 @@
         </w:tc>
         <w:tc>
           <w:tcPr>
-            <w:tcW w:w="1556" w:type="dxa"/>
+            <w:tcW w:w="1452" w:type="dxa"/>
             <w:tcBorders>
               <w:top w:val="single" w:sz="4" w:space="0" w:color="auto"/>
               <w:left w:val="single" w:sz="4" w:space="0" w:color="auto"/>
@@ -1012,7 +1021,7 @@
         </w:tc>
         <w:tc>
           <w:tcPr>
-            <w:tcW w:w="1045" w:type="dxa"/>
+            <w:tcW w:w="924" w:type="dxa"/>
             <w:tcBorders>
               <w:top w:val="single" w:sz="4" w:space="0" w:color="auto"/>
               <w:left w:val="single" w:sz="4" w:space="0" w:color="auto"/>
@@ -1041,7 +1050,7 @@
         </w:tc>
         <w:tc>
           <w:tcPr>
-            <w:tcW w:w="798" w:type="dxa"/>
+            <w:tcW w:w="754" w:type="dxa"/>
             <w:tcBorders>
               <w:top w:val="single" w:sz="4" w:space="0" w:color="auto"/>
               <w:left w:val="single" w:sz="4" w:space="0" w:color="auto"/>
@@ -1070,7 +1079,7 @@
         </w:tc>
         <w:tc>
           <w:tcPr>
-            <w:tcW w:w="874" w:type="dxa"/>
+            <w:tcW w:w="617" w:type="dxa"/>
             <w:tcBorders>
               <w:top w:val="single" w:sz="4" w:space="0" w:color="auto"/>
               <w:left w:val="single" w:sz="4" w:space="0" w:color="auto"/>
@@ -1099,7 +1108,7 @@
         </w:tc>
         <w:tc>
           <w:tcPr>
-            <w:tcW w:w="1142" w:type="dxa"/>
+            <w:tcW w:w="1785" w:type="dxa"/>
             <w:tcBorders>
               <w:top w:val="single" w:sz="4" w:space="0" w:color="auto"/>
               <w:left w:val="single" w:sz="4" w:space="0" w:color="auto"/>
@@ -1142,51 +1151,35 @@
         </w:tc>
         <w:tc>
           <w:tcPr>
-            <w:tcW w:w="1206" w:type="dxa"/>
-            <w:tcBorders>
-              <w:top w:val="single" w:sz="4" w:space="0" w:color="auto"/>
-              <w:left w:val="single" w:sz="4" w:space="0" w:color="auto"/>
-              <w:bottom w:val="single" w:sz="4" w:space="0" w:color="auto"/>
-              <w:right w:val="single" w:sz="4" w:space="0" w:color="auto"/>
-            </w:tcBorders>
-            <w:vAlign w:val="center"/>
-          </w:tcPr>
-          <w:p>
-            <w:pPr>
-              <w:jc w:val="center"/>
-              <w:rPr>
-                <w:rFonts w:ascii="Times New Roman" w:hAnsi="Times New Roman" w:cs="Times New Roman"/>
-                <w:sz w:val="24"/>
-              </w:rPr>
-            </w:pPr>
-            <w:r>
-              <w:rPr>
-                <w:rFonts w:ascii="Times New Roman" w:hAnsi="Times New Roman" w:cs="Times New Roman"/>
-                <w:sz w:val="24"/>
-              </w:rPr>
-              <w:t>{{gate</w:t>
-            </w:r>
-            <w:proofErr w:type="gramStart"/>
-            <w:r>
-              <w:rPr>
-                <w:rFonts w:ascii="Times New Roman" w:hAnsi="Times New Roman" w:cs="Times New Roman"/>
-                <w:sz w:val="24"/>
-              </w:rPr>
-              <w:t>}}</w:t>
-            </w:r>
-            <w:r>
-              <w:rPr>
-                <w:rFonts w:ascii="Times New Roman" w:hAnsi="Times New Roman" w:cs="Times New Roman"/>
-                <w:sz w:val="24"/>
-              </w:rPr>
-              <w:t>%</w:t>
-            </w:r>
-            <w:proofErr w:type="gramEnd"/>
-          </w:p>
-        </w:tc>
-        <w:tc>
-          <w:tcPr>
-            <w:tcW w:w="1463" w:type="dxa"/>
+            <w:tcW w:w="1182" w:type="dxa"/>
+            <w:tcBorders>
+              <w:top w:val="single" w:sz="4" w:space="0" w:color="auto"/>
+              <w:left w:val="single" w:sz="4" w:space="0" w:color="auto"/>
+              <w:bottom w:val="single" w:sz="4" w:space="0" w:color="auto"/>
+              <w:right w:val="single" w:sz="4" w:space="0" w:color="auto"/>
+            </w:tcBorders>
+            <w:vAlign w:val="center"/>
+          </w:tcPr>
+          <w:p>
+            <w:pPr>
+              <w:jc w:val="center"/>
+              <w:rPr>
+                <w:rFonts w:ascii="Times New Roman" w:hAnsi="Times New Roman" w:cs="Times New Roman"/>
+                <w:sz w:val="24"/>
+              </w:rPr>
+            </w:pPr>
+            <w:r>
+              <w:rPr>
+                <w:rFonts w:ascii="Times New Roman" w:hAnsi="Times New Roman" w:cs="Times New Roman"/>
+                <w:sz w:val="24"/>
+              </w:rPr>
+              <w:t>{{gate}}</w:t>
+            </w:r>
+          </w:p>
+        </w:tc>
+        <w:tc>
+          <w:tcPr>
+            <w:tcW w:w="1504" w:type="dxa"/>
             <w:tcBorders>
               <w:top w:val="single" w:sz="4" w:space="0" w:color="auto"/>
               <w:left w:val="single" w:sz="4" w:space="0" w:color="auto"/>
@@ -1234,7 +1227,7 @@
         </w:trPr>
         <w:tc>
           <w:tcPr>
-            <w:tcW w:w="10198" w:type="dxa"/>
+            <w:tcW w:w="9538" w:type="dxa"/>
             <w:gridSpan w:val="9"/>
             <w:tcBorders>
               <w:top w:val="single" w:sz="4" w:space="0" w:color="auto"/>
@@ -1277,7 +1270,7 @@
         </w:tc>
         <w:tc>
           <w:tcPr>
-            <w:tcW w:w="1142" w:type="dxa"/>
+            <w:tcW w:w="1785" w:type="dxa"/>
             <w:tcBorders>
               <w:top w:val="single" w:sz="4" w:space="0" w:color="auto"/>
               <w:left w:val="single" w:sz="4" w:space="0" w:color="auto"/>
@@ -1292,27 +1285,31 @@
               <w:jc w:val="center"/>
               <w:rPr>
                 <w:rFonts w:ascii="Times New Roman" w:eastAsia="Times New Roman" w:hAnsi="Times New Roman" w:cs="Times New Roman"/>
-                <w:sz w:val="24"/>
-              </w:rPr>
-            </w:pPr>
-            <w:r>
-              <w:rPr>
-                <w:rFonts w:ascii="Times New Roman" w:eastAsia="Times New Roman" w:hAnsi="Times New Roman" w:cs="Times New Roman"/>
-                <w:sz w:val="24"/>
+                <w:sz w:val="20"/>
+                <w:szCs w:val="20"/>
+              </w:rPr>
+            </w:pPr>
+            <w:r>
+              <w:rPr>
+                <w:rFonts w:ascii="Times New Roman" w:eastAsia="Times New Roman" w:hAnsi="Times New Roman" w:cs="Times New Roman"/>
+                <w:sz w:val="20"/>
+                <w:szCs w:val="20"/>
               </w:rPr>
               <w:t>{{</w:t>
             </w:r>
             <w:r>
               <w:rPr>
                 <w:rFonts w:ascii="Times New Roman" w:eastAsia="Times New Roman" w:hAnsi="Times New Roman" w:cs="Times New Roman"/>
-                <w:sz w:val="24"/>
+                <w:sz w:val="20"/>
+                <w:szCs w:val="20"/>
               </w:rPr>
               <w:t>TONGHDMB</w:t>
             </w:r>
             <w:r>
               <w:rPr>
                 <w:rFonts w:ascii="Times New Roman" w:eastAsia="Times New Roman" w:hAnsi="Times New Roman" w:cs="Times New Roman"/>
-                <w:sz w:val="24"/>
+                <w:sz w:val="20"/>
+                <w:szCs w:val="20"/>
               </w:rPr>
               <w:t>}}</w:t>
             </w:r>
@@ -1320,7 +1317,7 @@
         </w:tc>
         <w:tc>
           <w:tcPr>
-            <w:tcW w:w="1206" w:type="dxa"/>
+            <w:tcW w:w="1182" w:type="dxa"/>
             <w:tcBorders>
               <w:top w:val="single" w:sz="4" w:space="0" w:color="auto"/>
               <w:left w:val="single" w:sz="4" w:space="0" w:color="auto"/>
@@ -1336,14 +1333,14 @@
               <w:rPr>
                 <w:rFonts w:ascii="Times New Roman" w:eastAsia="Times New Roman" w:hAnsi="Times New Roman" w:cs="Times New Roman"/>
                 <w:color w:val="FF0000"/>
-                <w:sz w:val="24"/>
-              </w:rPr>
-            </w:pPr>
-          </w:p>
-        </w:tc>
-        <w:tc>
-          <w:tcPr>
-            <w:tcW w:w="1463" w:type="dxa"/>
+                <w:szCs w:val="22"/>
+              </w:rPr>
+            </w:pPr>
+          </w:p>
+        </w:tc>
+        <w:tc>
+          <w:tcPr>
+            <w:tcW w:w="1504" w:type="dxa"/>
             <w:tcBorders>
               <w:top w:val="single" w:sz="4" w:space="0" w:color="auto"/>
               <w:left w:val="single" w:sz="4" w:space="0" w:color="auto"/>
@@ -1358,13 +1355,13 @@
               <w:jc w:val="center"/>
               <w:rPr>
                 <w:rFonts w:ascii="Times New Roman" w:eastAsia="Times New Roman" w:hAnsi="Times New Roman" w:cs="Times New Roman"/>
-                <w:sz w:val="24"/>
-              </w:rPr>
-            </w:pPr>
-            <w:r>
-              <w:rPr>
-                <w:rFonts w:ascii="Times New Roman" w:eastAsia="Times New Roman" w:hAnsi="Times New Roman" w:cs="Times New Roman"/>
-                <w:sz w:val="24"/>
+                <w:szCs w:val="22"/>
+              </w:rPr>
+            </w:pPr>
+            <w:r>
+              <w:rPr>
+                <w:rFonts w:ascii="Times New Roman" w:eastAsia="Times New Roman" w:hAnsi="Times New Roman" w:cs="Times New Roman"/>
+                <w:szCs w:val="22"/>
               </w:rPr>
               <w:t>{{TONG_BL}}</w:t>
             </w:r>

</xml_diff>